<commit_message>
Add intro tab links and improve intro link styling. Other cleanup as well.
</commit_message>
<xml_diff>
--- a/biochar_app/markdown/docx/intro.docx
+++ b/biochar_app/markdown/docx/intro.docx
@@ -24,7 +24,13 @@
         <w:t>fourth</w:t>
       </w:r>
       <w:r>
-        <w:t xml:space="preserve"> year. This </w:t>
+        <w:t xml:space="preserve"> year</w:t>
+      </w:r>
+      <w:r>
+        <w:t>, 2026</w:t>
+      </w:r>
+      <w:r>
+        <w:t xml:space="preserve">. This </w:t>
       </w:r>
       <w:r>
         <w:t xml:space="preserve">is </w:t>
@@ -149,6 +155,137 @@
       </w:r>
     </w:p>
     <w:p>
+      <w:r>
+        <w:t>Two categories of collected data – from continuous monitoring and lab-based results</w:t>
+      </w:r>
+      <w:r>
+        <w:t xml:space="preserve"> – are reported</w:t>
+      </w:r>
+      <w:r>
+        <w:t>.</w:t>
+      </w:r>
+    </w:p>
+    <w:p>
+      <w:pPr>
+        <w:pStyle w:val="ListParagraph"/>
+        <w:numPr>
+          <w:ilvl w:val="0"/>
+          <w:numId w:val="9"/>
+        </w:numPr>
+      </w:pPr>
+      <w:r>
+        <w:t xml:space="preserve">The </w:t>
+      </w:r>
+      <w:r>
+        <w:t>C</w:t>
+      </w:r>
+      <w:r>
+        <w:t xml:space="preserve">ontinuous </w:t>
+      </w:r>
+      <w:r>
+        <w:t>M</w:t>
+      </w:r>
+      <w:r>
+        <w:t xml:space="preserve">onitoring </w:t>
+      </w:r>
+      <w:r>
+        <w:t>D</w:t>
+      </w:r>
+      <w:r>
+        <w:t xml:space="preserve">ata </w:t>
+      </w:r>
+      <w:r>
+        <w:t xml:space="preserve">tab includes </w:t>
+      </w:r>
+      <w:r>
+        <w:t>graphical (</w:t>
+      </w:r>
+      <w:r>
+        <w:t>Interactive Plots</w:t>
+      </w:r>
+      <w:r>
+        <w:t>)</w:t>
+      </w:r>
+      <w:r>
+        <w:t xml:space="preserve"> </w:t>
+      </w:r>
+      <w:r>
+        <w:t xml:space="preserve">and tabular </w:t>
+      </w:r>
+      <w:r>
+        <w:t>formats</w:t>
+      </w:r>
+      <w:r>
+        <w:t xml:space="preserve"> (Summary Statistics)</w:t>
+      </w:r>
+      <w:r>
+        <w:t>.</w:t>
+      </w:r>
+    </w:p>
+    <w:p>
+      <w:pPr>
+        <w:pStyle w:val="p1"/>
+        <w:numPr>
+          <w:ilvl w:val="0"/>
+          <w:numId w:val="8"/>
+        </w:numPr>
+      </w:pPr>
+      <w:r>
+        <w:t xml:space="preserve">The Lab-Based Results </w:t>
+      </w:r>
+      <w:r>
+        <w:t>t</w:t>
+      </w:r>
+      <w:r>
+        <w:t>ab</w:t>
+      </w:r>
+      <w:r>
+        <w:t xml:space="preserve"> includes results </w:t>
+      </w:r>
+      <w:r>
+        <w:t xml:space="preserve"> that present data on forage quality </w:t>
+      </w:r>
+      <w:r>
+        <w:t xml:space="preserve"> (Pasture Quality Metrics) </w:t>
+      </w:r>
+      <w:r>
+        <w:t>and quantity</w:t>
+      </w:r>
+      <w:r>
+        <w:t xml:space="preserve"> (</w:t>
+      </w:r>
+      <w:r>
+        <w:t>Biomass (Field Samples)</w:t>
+      </w:r>
+      <w:r>
+        <w:t>)</w:t>
+      </w:r>
+      <w:r>
+        <w:t xml:space="preserve">, </w:t>
+      </w:r>
+      <w:r>
+        <w:t>soil</w:t>
+      </w:r>
+      <w:r>
+        <w:t xml:space="preserve"> biological health</w:t>
+      </w:r>
+      <w:r>
+        <w:t xml:space="preserve"> (Biological Health) and soil chemistry (Soil Chemistry)</w:t>
+      </w:r>
+      <w:r>
+        <w:t>.</w:t>
+      </w:r>
+    </w:p>
+    <w:p>
+      <w:pPr>
+        <w:pStyle w:val="p1"/>
+        <w:ind w:left="720"/>
+      </w:pPr>
+      <w:r>
+        <w:t>The remaining tabs are</w:t>
+      </w:r>
+    </w:p>
+    <w:p>
       <w:pPr>
         <w:pStyle w:val="ListParagraph"/>
         <w:numPr>
@@ -157,22 +294,7 @@
         </w:numPr>
       </w:pPr>
       <w:r>
-        <w:t>Digital data collection results in graphical (</w:t>
-      </w:r>
-      <w:r>
-        <w:t>Interactive Plots</w:t>
-      </w:r>
-      <w:r>
-        <w:t xml:space="preserve"> tab)</w:t>
-      </w:r>
-      <w:r>
-        <w:t xml:space="preserve"> </w:t>
-      </w:r>
-      <w:r>
-        <w:t>and tabular form (Summary Statistics tab)</w:t>
-      </w:r>
-      <w:r>
-        <w:t>.</w:t>
+        <w:t>Technical details on the data collection process.</w:t>
       </w:r>
     </w:p>
     <w:p>
@@ -184,7 +306,25 @@
         </w:numPr>
       </w:pPr>
       <w:r>
-        <w:t>Tabs that present data on forage quality and quantity, soil chemistry and soil biological health.</w:t>
+        <w:t>Bulk download of all data available – Campbell Scientific sensor data, local weather variables,</w:t>
+      </w:r>
+      <w:r>
+        <w:t xml:space="preserve"> fertilizer</w:t>
+      </w:r>
+      <w:r>
+        <w:t xml:space="preserve"> </w:t>
+      </w:r>
+      <w:r>
+        <w:t>application</w:t>
+      </w:r>
+      <w:r>
+        <w:t xml:space="preserve"> and irrigation water applied</w:t>
+      </w:r>
+      <w:r>
+        <w:t>, soil results and yield quantity and quality</w:t>
+      </w:r>
+      <w:r>
+        <w:t>.</w:t>
       </w:r>
     </w:p>
     <w:p>
@@ -196,37 +336,7 @@
         </w:numPr>
       </w:pPr>
       <w:r>
-        <w:t>Technical details on the data collection process.</w:t>
-      </w:r>
-    </w:p>
-    <w:p>
-      <w:pPr>
-        <w:pStyle w:val="ListParagraph"/>
-        <w:numPr>
-          <w:ilvl w:val="0"/>
-          <w:numId w:val="5"/>
-        </w:numPr>
-      </w:pPr>
-      <w:r>
-        <w:t>Bulk download of all data available – Campbell Scientific sensor data, local weather variables,</w:t>
-      </w:r>
-      <w:r>
-        <w:t xml:space="preserve"> fertilizer</w:t>
-      </w:r>
-      <w:r>
-        <w:t xml:space="preserve"> </w:t>
-      </w:r>
-      <w:r>
-        <w:t>application</w:t>
-      </w:r>
-      <w:r>
-        <w:t xml:space="preserve"> and irrigation water applied</w:t>
-      </w:r>
-      <w:r>
-        <w:t>, soil results and yield quantity and quality</w:t>
-      </w:r>
-      <w:r>
-        <w:t>.</w:t>
+        <w:t>Acknowledgements of everyone who has made this project possible.</w:t>
       </w:r>
     </w:p>
     <w:p>
@@ -318,6 +428,7 @@
         <w:rPr>
           <w:noProof/>
         </w:rPr>
+        <w:lastRenderedPageBreak/>
         <w:drawing>
           <wp:inline distT="0" distB="0" distL="0" distR="0" wp14:anchorId="0D1C6F4F" wp14:editId="4EB5D4DC">
             <wp:extent cx="3042397" cy="2286000"/>
@@ -452,11 +563,7 @@
         <w:t>)</w:t>
       </w:r>
       <w:r>
-        <w:t xml:space="preserve">. It </w:t>
-      </w:r>
-      <w:r>
-        <w:lastRenderedPageBreak/>
-        <w:t>provide</w:t>
+        <w:t>. It provide</w:t>
       </w:r>
       <w:r>
         <w:t>d</w:t>
@@ -533,6 +640,7 @@
               <w:rPr>
                 <w:noProof/>
               </w:rPr>
+              <w:lastRenderedPageBreak/>
               <w:drawing>
                 <wp:inline distT="0" distB="0" distL="0" distR="0" wp14:anchorId="3632D1B9" wp14:editId="56A46B24">
                   <wp:extent cx="3009900" cy="3483762"/>
@@ -615,7 +723,7 @@
                 <w:noProof/>
               </w:rPr>
               <w:drawing>
-                <wp:inline distT="0" distB="0" distL="0" distR="0" wp14:anchorId="67F4B401" wp14:editId="7B8A8F6D">
+                <wp:inline distT="0" distB="0" distL="0" distR="0" wp14:anchorId="67F4B401" wp14:editId="6321BEC8">
                   <wp:extent cx="2709011" cy="2159000"/>
                   <wp:effectExtent l="0" t="0" r="0" b="0"/>
                   <wp:docPr id="2129013784" name="Picture 3" descr="Biochar chemical structure"/>
@@ -1059,6 +1167,119 @@
     </w:lvl>
   </w:abstractNum>
   <w:abstractNum w:abstractNumId="3" w15:restartNumberingAfterBreak="0">
+    <w:nsid w:val="49C848FD"/>
+    <w:multiLevelType w:val="hybridMultilevel"/>
+    <w:tmpl w:val="A19A3626"/>
+    <w:lvl w:ilvl="0" w:tplc="04090001">
+      <w:start w:val="1"/>
+      <w:numFmt w:val="bullet"/>
+      <w:lvlText w:val=""/>
+      <w:lvlJc w:val="left"/>
+      <w:pPr>
+        <w:ind w:left="720" w:hanging="360"/>
+      </w:pPr>
+      <w:rPr>
+        <w:rFonts w:ascii="Symbol" w:hAnsi="Symbol" w:hint="default"/>
+      </w:rPr>
+    </w:lvl>
+    <w:lvl w:ilvl="1" w:tplc="04090003" w:tentative="1">
+      <w:start w:val="1"/>
+      <w:numFmt w:val="bullet"/>
+      <w:lvlText w:val="o"/>
+      <w:lvlJc w:val="left"/>
+      <w:pPr>
+        <w:ind w:left="1440" w:hanging="360"/>
+      </w:pPr>
+      <w:rPr>
+        <w:rFonts w:ascii="Courier New" w:hAnsi="Courier New" w:hint="default"/>
+      </w:rPr>
+    </w:lvl>
+    <w:lvl w:ilvl="2" w:tplc="04090005" w:tentative="1">
+      <w:start w:val="1"/>
+      <w:numFmt w:val="bullet"/>
+      <w:lvlText w:val=""/>
+      <w:lvlJc w:val="left"/>
+      <w:pPr>
+        <w:ind w:left="2160" w:hanging="360"/>
+      </w:pPr>
+      <w:rPr>
+        <w:rFonts w:ascii="Wingdings" w:hAnsi="Wingdings" w:hint="default"/>
+      </w:rPr>
+    </w:lvl>
+    <w:lvl w:ilvl="3" w:tplc="04090001" w:tentative="1">
+      <w:start w:val="1"/>
+      <w:numFmt w:val="bullet"/>
+      <w:lvlText w:val=""/>
+      <w:lvlJc w:val="left"/>
+      <w:pPr>
+        <w:ind w:left="2880" w:hanging="360"/>
+      </w:pPr>
+      <w:rPr>
+        <w:rFonts w:ascii="Symbol" w:hAnsi="Symbol" w:hint="default"/>
+      </w:rPr>
+    </w:lvl>
+    <w:lvl w:ilvl="4" w:tplc="04090003" w:tentative="1">
+      <w:start w:val="1"/>
+      <w:numFmt w:val="bullet"/>
+      <w:lvlText w:val="o"/>
+      <w:lvlJc w:val="left"/>
+      <w:pPr>
+        <w:ind w:left="3600" w:hanging="360"/>
+      </w:pPr>
+      <w:rPr>
+        <w:rFonts w:ascii="Courier New" w:hAnsi="Courier New" w:hint="default"/>
+      </w:rPr>
+    </w:lvl>
+    <w:lvl w:ilvl="5" w:tplc="04090005" w:tentative="1">
+      <w:start w:val="1"/>
+      <w:numFmt w:val="bullet"/>
+      <w:lvlText w:val=""/>
+      <w:lvlJc w:val="left"/>
+      <w:pPr>
+        <w:ind w:left="4320" w:hanging="360"/>
+      </w:pPr>
+      <w:rPr>
+        <w:rFonts w:ascii="Wingdings" w:hAnsi="Wingdings" w:hint="default"/>
+      </w:rPr>
+    </w:lvl>
+    <w:lvl w:ilvl="6" w:tplc="04090001" w:tentative="1">
+      <w:start w:val="1"/>
+      <w:numFmt w:val="bullet"/>
+      <w:lvlText w:val=""/>
+      <w:lvlJc w:val="left"/>
+      <w:pPr>
+        <w:ind w:left="5040" w:hanging="360"/>
+      </w:pPr>
+      <w:rPr>
+        <w:rFonts w:ascii="Symbol" w:hAnsi="Symbol" w:hint="default"/>
+      </w:rPr>
+    </w:lvl>
+    <w:lvl w:ilvl="7" w:tplc="04090003" w:tentative="1">
+      <w:start w:val="1"/>
+      <w:numFmt w:val="bullet"/>
+      <w:lvlText w:val="o"/>
+      <w:lvlJc w:val="left"/>
+      <w:pPr>
+        <w:ind w:left="5760" w:hanging="360"/>
+      </w:pPr>
+      <w:rPr>
+        <w:rFonts w:ascii="Courier New" w:hAnsi="Courier New" w:hint="default"/>
+      </w:rPr>
+    </w:lvl>
+    <w:lvl w:ilvl="8" w:tplc="04090005" w:tentative="1">
+      <w:start w:val="1"/>
+      <w:numFmt w:val="bullet"/>
+      <w:lvlText w:val=""/>
+      <w:lvlJc w:val="left"/>
+      <w:pPr>
+        <w:ind w:left="6480" w:hanging="360"/>
+      </w:pPr>
+      <w:rPr>
+        <w:rFonts w:ascii="Wingdings" w:hAnsi="Wingdings" w:hint="default"/>
+      </w:rPr>
+    </w:lvl>
+  </w:abstractNum>
+  <w:abstractNum w:abstractNumId="4" w15:restartNumberingAfterBreak="0">
     <w:nsid w:val="4EC94CD3"/>
     <w:multiLevelType w:val="hybridMultilevel"/>
     <w:tmpl w:val="6A9C55F4"/>
@@ -1170,7 +1391,156 @@
       </w:rPr>
     </w:lvl>
   </w:abstractNum>
-  <w:abstractNum w:abstractNumId="4" w15:restartNumberingAfterBreak="0">
+  <w:abstractNum w:abstractNumId="5" w15:restartNumberingAfterBreak="0">
+    <w:nsid w:val="55EC16CC"/>
+    <w:multiLevelType w:val="multilevel"/>
+    <w:tmpl w:val="920C420A"/>
+    <w:lvl w:ilvl="0">
+      <w:start w:val="1"/>
+      <w:numFmt w:val="bullet"/>
+      <w:lvlText w:val=""/>
+      <w:lvlJc w:val="left"/>
+      <w:pPr>
+        <w:tabs>
+          <w:tab w:val="num" w:pos="720"/>
+        </w:tabs>
+        <w:ind w:left="720" w:hanging="360"/>
+      </w:pPr>
+      <w:rPr>
+        <w:rFonts w:ascii="Symbol" w:hAnsi="Symbol" w:hint="default"/>
+        <w:sz w:val="20"/>
+      </w:rPr>
+    </w:lvl>
+    <w:lvl w:ilvl="1" w:tentative="1">
+      <w:start w:val="1"/>
+      <w:numFmt w:val="bullet"/>
+      <w:lvlText w:val="o"/>
+      <w:lvlJc w:val="left"/>
+      <w:pPr>
+        <w:tabs>
+          <w:tab w:val="num" w:pos="1440"/>
+        </w:tabs>
+        <w:ind w:left="1440" w:hanging="360"/>
+      </w:pPr>
+      <w:rPr>
+        <w:rFonts w:ascii="Courier New" w:hAnsi="Courier New" w:hint="default"/>
+        <w:sz w:val="20"/>
+      </w:rPr>
+    </w:lvl>
+    <w:lvl w:ilvl="2" w:tentative="1">
+      <w:start w:val="1"/>
+      <w:numFmt w:val="bullet"/>
+      <w:lvlText w:val=""/>
+      <w:lvlJc w:val="left"/>
+      <w:pPr>
+        <w:tabs>
+          <w:tab w:val="num" w:pos="2160"/>
+        </w:tabs>
+        <w:ind w:left="2160" w:hanging="360"/>
+      </w:pPr>
+      <w:rPr>
+        <w:rFonts w:ascii="Wingdings" w:hAnsi="Wingdings" w:hint="default"/>
+        <w:sz w:val="20"/>
+      </w:rPr>
+    </w:lvl>
+    <w:lvl w:ilvl="3" w:tentative="1">
+      <w:start w:val="1"/>
+      <w:numFmt w:val="bullet"/>
+      <w:lvlText w:val=""/>
+      <w:lvlJc w:val="left"/>
+      <w:pPr>
+        <w:tabs>
+          <w:tab w:val="num" w:pos="2880"/>
+        </w:tabs>
+        <w:ind w:left="2880" w:hanging="360"/>
+      </w:pPr>
+      <w:rPr>
+        <w:rFonts w:ascii="Wingdings" w:hAnsi="Wingdings" w:hint="default"/>
+        <w:sz w:val="20"/>
+      </w:rPr>
+    </w:lvl>
+    <w:lvl w:ilvl="4" w:tentative="1">
+      <w:start w:val="1"/>
+      <w:numFmt w:val="bullet"/>
+      <w:lvlText w:val=""/>
+      <w:lvlJc w:val="left"/>
+      <w:pPr>
+        <w:tabs>
+          <w:tab w:val="num" w:pos="3600"/>
+        </w:tabs>
+        <w:ind w:left="3600" w:hanging="360"/>
+      </w:pPr>
+      <w:rPr>
+        <w:rFonts w:ascii="Wingdings" w:hAnsi="Wingdings" w:hint="default"/>
+        <w:sz w:val="20"/>
+      </w:rPr>
+    </w:lvl>
+    <w:lvl w:ilvl="5" w:tentative="1">
+      <w:start w:val="1"/>
+      <w:numFmt w:val="bullet"/>
+      <w:lvlText w:val=""/>
+      <w:lvlJc w:val="left"/>
+      <w:pPr>
+        <w:tabs>
+          <w:tab w:val="num" w:pos="4320"/>
+        </w:tabs>
+        <w:ind w:left="4320" w:hanging="360"/>
+      </w:pPr>
+      <w:rPr>
+        <w:rFonts w:ascii="Wingdings" w:hAnsi="Wingdings" w:hint="default"/>
+        <w:sz w:val="20"/>
+      </w:rPr>
+    </w:lvl>
+    <w:lvl w:ilvl="6" w:tentative="1">
+      <w:start w:val="1"/>
+      <w:numFmt w:val="bullet"/>
+      <w:lvlText w:val=""/>
+      <w:lvlJc w:val="left"/>
+      <w:pPr>
+        <w:tabs>
+          <w:tab w:val="num" w:pos="5040"/>
+        </w:tabs>
+        <w:ind w:left="5040" w:hanging="360"/>
+      </w:pPr>
+      <w:rPr>
+        <w:rFonts w:ascii="Wingdings" w:hAnsi="Wingdings" w:hint="default"/>
+        <w:sz w:val="20"/>
+      </w:rPr>
+    </w:lvl>
+    <w:lvl w:ilvl="7" w:tentative="1">
+      <w:start w:val="1"/>
+      <w:numFmt w:val="bullet"/>
+      <w:lvlText w:val=""/>
+      <w:lvlJc w:val="left"/>
+      <w:pPr>
+        <w:tabs>
+          <w:tab w:val="num" w:pos="5760"/>
+        </w:tabs>
+        <w:ind w:left="5760" w:hanging="360"/>
+      </w:pPr>
+      <w:rPr>
+        <w:rFonts w:ascii="Wingdings" w:hAnsi="Wingdings" w:hint="default"/>
+        <w:sz w:val="20"/>
+      </w:rPr>
+    </w:lvl>
+    <w:lvl w:ilvl="8" w:tentative="1">
+      <w:start w:val="1"/>
+      <w:numFmt w:val="bullet"/>
+      <w:lvlText w:val=""/>
+      <w:lvlJc w:val="left"/>
+      <w:pPr>
+        <w:tabs>
+          <w:tab w:val="num" w:pos="6480"/>
+        </w:tabs>
+        <w:ind w:left="6480" w:hanging="360"/>
+      </w:pPr>
+      <w:rPr>
+        <w:rFonts w:ascii="Wingdings" w:hAnsi="Wingdings" w:hint="default"/>
+        <w:sz w:val="20"/>
+      </w:rPr>
+    </w:lvl>
+  </w:abstractNum>
+  <w:abstractNum w:abstractNumId="6" w15:restartNumberingAfterBreak="0">
     <w:nsid w:val="73100CAD"/>
     <w:multiLevelType w:val="hybridMultilevel"/>
     <w:tmpl w:val="2C02CEF6"/>
@@ -1283,7 +1653,7 @@
       </w:rPr>
     </w:lvl>
   </w:abstractNum>
-  <w:abstractNum w:abstractNumId="5" w15:restartNumberingAfterBreak="0">
+  <w:abstractNum w:abstractNumId="7" w15:restartNumberingAfterBreak="0">
     <w:nsid w:val="78AA6ACC"/>
     <w:multiLevelType w:val="hybridMultilevel"/>
     <w:tmpl w:val="AA3C3F94"/>
@@ -1395,7 +1765,7 @@
       </w:rPr>
     </w:lvl>
   </w:abstractNum>
-  <w:abstractNum w:abstractNumId="6" w15:restartNumberingAfterBreak="0">
+  <w:abstractNum w:abstractNumId="8" w15:restartNumberingAfterBreak="0">
     <w:nsid w:val="79B44C28"/>
     <w:multiLevelType w:val="hybridMultilevel"/>
     <w:tmpl w:val="4EFC8EB4"/>
@@ -1511,22 +1881,28 @@
     <w:abstractNumId w:val="0"/>
   </w:num>
   <w:num w:numId="2" w16cid:durableId="1575510186">
-    <w:abstractNumId w:val="3"/>
+    <w:abstractNumId w:val="4"/>
   </w:num>
   <w:num w:numId="3" w16cid:durableId="9454759">
-    <w:abstractNumId w:val="5"/>
+    <w:abstractNumId w:val="7"/>
   </w:num>
   <w:num w:numId="4" w16cid:durableId="1989816764">
     <w:abstractNumId w:val="1"/>
   </w:num>
   <w:num w:numId="5" w16cid:durableId="7022247">
-    <w:abstractNumId w:val="4"/>
+    <w:abstractNumId w:val="6"/>
   </w:num>
   <w:num w:numId="6" w16cid:durableId="1333294703">
     <w:abstractNumId w:val="2"/>
   </w:num>
   <w:num w:numId="7" w16cid:durableId="1677269357">
-    <w:abstractNumId w:val="6"/>
+    <w:abstractNumId w:val="8"/>
+  </w:num>
+  <w:num w:numId="8" w16cid:durableId="1827012637">
+    <w:abstractNumId w:val="5"/>
+  </w:num>
+  <w:num w:numId="9" w16cid:durableId="843595765">
+    <w:abstractNumId w:val="3"/>
   </w:num>
 </w:numbering>
 </file>
@@ -2543,6 +2919,19 @@
       </w:tblBorders>
     </w:tblPr>
   </w:style>
+  <w:style w:type="paragraph" w:customStyle="1" w:styleId="p1">
+    <w:name w:val="p1"/>
+    <w:basedOn w:val="Normal"/>
+    <w:rsid w:val="00F53A0D"/>
+    <w:pPr>
+      <w:spacing w:before="100" w:beforeAutospacing="1" w:after="100" w:afterAutospacing="1"/>
+    </w:pPr>
+    <w:rPr>
+      <w:rFonts w:eastAsia="Times New Roman" w:cs="Times New Roman"/>
+      <w:kern w:val="0"/>
+      <w14:ligatures w14:val="none"/>
+    </w:rPr>
+  </w:style>
 </w:styles>
 </file>
 

</xml_diff>